<commit_message>
PKL & Surat: kaki ACC di bawah NB, operator atur siswa diterima di Surat Balasan, ganti tema tak dicatat Audit Log
- Surat Penarikan & Balasan (Word): "Surat ini disetujui secara elektronik" pindah ke paling bawah
  (sesudah NB + kontak), 2 baris kecil bergaris; tetap 1 halaman F4 sampai 5 siswa (diukur di Word)
- Surat Balasan: centang "Siswa yang diterima perusahaan" di form buat & ubah; yang tidak dicentang
  dikeluarkan dari ajuan sebagai "Ditolak perusahaan" dengan alasan (+ API: diterima / siswa, alasan_tolak)
- Audit Log: ganti tema tampilan tidak dicatat lagi
- Uji dev:uji-surat 324 cek; panduan docs/PANDUAN-DEPLOY-PKL-2026-10-21.md (git pull + Ctrl+F5, tanpa migrasi)

Co-Authored-By: Claude Opus 5.5 <noreply@anthropic.com>
</commit_message>
<xml_diff>
--- a/app/Libraries/Surat/balasan_pkl.docx
+++ b/app/Libraries/Surat/balasan_pkl.docx
@@ -2583,25 +2583,22 @@
     <w:p>
       <w:pPr>
         <w:pStyle w:val="NoSpacing"/>
-        <w:spacing w:before="0" w:after="0" w:line="138" w:lineRule="exact"/>
-        <w:jc w:val="left"/>
-        <w:rPr>
-          <w:rFonts w:ascii="Times New Roman" w:hAnsi="Times New Roman" w:cs="Times New Roman"/>
-          <w:color w:val="595959"/>
-          <w:sz w:val="12"/>
-          <w:szCs w:val="12"/>
-          <w:lang w:val="id-ID"/>
-        </w:rPr>
-      </w:pPr>
-      <w:r>
-        <w:rPr>
-          <w:rFonts w:ascii="Times New Roman" w:hAnsi="Times New Roman" w:cs="Times New Roman"/>
-          <w:color w:val="595959"/>
-          <w:sz w:val="12"/>
-          <w:szCs w:val="12"/>
-          <w:lang w:val="id-ID"/>
-        </w:rPr>
-        <w:t xml:space="preserve">${acc_footer}</w:t>
+        <w:jc w:val="both"/>
+        <w:rPr>
+          <w:rFonts w:ascii="Times New Roman" w:hAnsi="Times New Roman" w:cs="Times New Roman"/>
+          <w:sz w:val="24"/>
+          <w:szCs w:val="24"/>
+          <w:lang w:val="id-ID" w:eastAsia="ja-JP"/>
+        </w:rPr>
+      </w:pPr>
+      <w:r>
+        <w:rPr>
+          <w:rFonts w:ascii="Times New Roman" w:hAnsi="Times New Roman" w:cs="Times New Roman"/>
+          <w:sz w:val="24"/>
+          <w:szCs w:val="24"/>
+          <w:lang w:val="id-ID" w:eastAsia="ja-JP"/>
+        </w:rPr>
+        <w:t>NB :</w:t>
       </w:r>
     </w:p>
     <w:p>
@@ -2622,41 +2619,8 @@
           <w:szCs w:val="24"/>
           <w:lang w:val="id-ID" w:eastAsia="ja-JP"/>
         </w:rPr>
-        <w:t>NB :</w:t>
-      </w:r>
-    </w:p>
-    <w:p>
-      <w:pPr>
-        <w:pStyle w:val="NoSpacing"/>
-        <w:jc w:val="both"/>
-        <w:rPr>
-          <w:rFonts w:ascii="Times New Roman" w:hAnsi="Times New Roman" w:cs="Times New Roman"/>
-          <w:sz w:val="24"/>
-          <w:szCs w:val="24"/>
-          <w:lang w:val="id-ID" w:eastAsia="ja-JP"/>
-        </w:rPr>
-      </w:pPr>
-      <w:r>
-        <w:rPr>
-          <w:rFonts w:ascii="Times New Roman" w:hAnsi="Times New Roman" w:cs="Times New Roman"/>
-          <w:sz w:val="24"/>
-          <w:szCs w:val="24"/>
-          <w:lang w:val="id-ID" w:eastAsia="ja-JP"/>
-        </w:rPr>
         <w:t>Jika ada hal penting harap menghubungi :</w:t>
       </w:r>
-    </w:p>
-    <w:p>
-      <w:pPr>
-        <w:pStyle w:val="NoSpacing"/>
-        <w:jc w:val="both"/>
-        <w:rPr>
-          <w:rFonts w:ascii="Times New Roman" w:hAnsi="Times New Roman" w:cs="Times New Roman"/>
-          <w:sz w:val="24"/>
-          <w:szCs w:val="24"/>
-          <w:lang w:val="sv-SE" w:eastAsia="ja-JP"/>
-        </w:rPr>
-      </w:pPr>
     </w:p>
     <w:p>
       <w:pPr>
@@ -2682,6 +2646,33 @@
           <w:lang w:eastAsia="ja-JP"/>
         </w:rPr>
         <w:t xml:space="preserve">${kontak_sekolah_nama}   ${kontak_sekolah_hp}</w:t>
+      </w:r>
+    </w:p>
+    <w:p>
+      <w:pPr>
+        <w:pStyle w:val="NoSpacing"/>
+        <w:pBdr>
+          <w:top w:val="single" w:sz="4" w:space="1" w:color="A6A6A6"/>
+        </w:pBdr>
+        <w:spacing w:before="0" w:after="0"/>
+        <w:jc w:val="left"/>
+        <w:rPr>
+          <w:rFonts w:ascii="Times New Roman" w:hAnsi="Times New Roman" w:cs="Times New Roman"/>
+          <w:color w:val="595959"/>
+          <w:sz w:val="13"/>
+          <w:szCs w:val="13"/>
+          <w:lang w:val="id-ID"/>
+        </w:rPr>
+      </w:pPr>
+      <w:r>
+        <w:rPr>
+          <w:rFonts w:ascii="Times New Roman" w:hAnsi="Times New Roman" w:cs="Times New Roman"/>
+          <w:color w:val="595959"/>
+          <w:sz w:val="13"/>
+          <w:szCs w:val="13"/>
+          <w:lang w:val="id-ID"/>
+        </w:rPr>
+        <w:t xml:space="preserve">${acc_footer}</w:t>
       </w:r>
     </w:p>
     <w:sectPr>

</xml_diff>

<commit_message>
Word Surat Balasan, Perpanjangan, Penarikan PKL: tambah kolom NIS (sama dengan format Surat Permohonan PKL sekolah)
- Tabel siswa ketiga template kini NO | NAMA | NIS | KELAS | KONSENTRASI KEAHLIAN | NOMOR HANDPHONE, lebar kolom persis
  surat_pkl_binus.docx (sel NIS = salinan sel KELAS, gaya sama). Data NIS sudah dikirim perakit (siswa_nis), tanpa ubah kode.
- Dicek dengan Word: tetap 1 halaman untuk 5 siswa (data hosting asli & 5 nama terpanjang). Surat lama yang diunduh ulang ikut
  berkolom NIS, nomor tetap.
- Uji: cek "badan surat sama persis dengan contoh sekolah" kini mengabaikan sel judul NIS baru dan mewajibkan NIS terisi;
  perpanjangan memeriksa NIS di Word. surat 401/0, perpanjangan 126/0.
- API tidak berubah (unduh Word otomatis berkolom NIS; GET surat/{id} sudah memuat siswa[].nis) — dicatat di docs/API-SURAT.md.

Server: git pull + Ctrl+F5 (tanpa migrasi).

Co-Authored-By: Claude Opus 5.5 <noreply@anthropic.com>
</commit_message>
<xml_diff>
--- a/app/Libraries/Surat/balasan_pkl.docx
+++ b/app/Libraries/Surat/balasan_pkl.docx
@@ -483,10 +483,11 @@
       </w:tblPr>
       <w:tblGrid>
         <w:gridCol w:w="576"/>
-        <w:gridCol w:w="2804"/>
-        <w:gridCol w:w="1506"/>
-        <w:gridCol w:w="2037"/>
-        <w:gridCol w:w="2545"/>
+        <w:gridCol w:w="2444"/>
+        <w:gridCol w:w="1360"/>
+        <w:gridCol w:w="1406"/>
+        <w:gridCol w:w="1900"/>
+        <w:gridCol w:w="1782"/>
       </w:tblGrid>
       <w:tr>
         <w:trPr>
@@ -535,7 +536,7 @@
         </w:tc>
         <w:tc>
           <w:tcPr>
-            <w:tcW w:w="2804" w:type="dxa"/>
+            <w:tcW w:w="2444" w:type="dxa"/>
           </w:tcPr>
           <w:p>
             <w:pPr>
@@ -589,7 +590,48 @@
         </w:tc>
         <w:tc>
           <w:tcPr>
-            <w:tcW w:w="1506" w:type="dxa"/>
+            <w:tcW w:w="1360" w:type="dxa"/>
+          </w:tcPr>
+          <w:p>
+            <w:pPr>
+              <w:pStyle w:val="NoSpacing"/>
+              <w:jc w:val="center"/>
+              <w:rPr>
+                <w:rFonts w:ascii="Times New Roman" w:hAnsi="Times New Roman" w:cs="Times New Roman"/>
+                <w:b/>
+                <w:sz w:val="24"/>
+                <w:szCs w:val="24"/>
+                <w:lang w:val="id-ID" w:eastAsia="ja-JP"/>
+              </w:rPr>
+            </w:pPr>
+          </w:p>
+          <w:p>
+            <w:pPr>
+              <w:pStyle w:val="NoSpacing"/>
+              <w:jc w:val="center"/>
+              <w:rPr>
+                <w:rFonts w:ascii="Times New Roman" w:hAnsi="Times New Roman" w:cs="Times New Roman"/>
+                <w:b/>
+                <w:sz w:val="24"/>
+                <w:szCs w:val="24"/>
+                <w:lang w:val="id-ID" w:eastAsia="ja-JP"/>
+              </w:rPr>
+            </w:pPr>
+            <w:r>
+              <w:rPr>
+                <w:rFonts w:ascii="Times New Roman" w:hAnsi="Times New Roman" w:cs="Times New Roman"/>
+                <w:b/>
+                <w:sz w:val="24"/>
+                <w:szCs w:val="24"/>
+                <w:lang w:val="id-ID" w:eastAsia="ja-JP"/>
+              </w:rPr>
+              <w:t>NIS</w:t>
+            </w:r>
+          </w:p>
+        </w:tc>
+        <w:tc>
+          <w:tcPr>
+            <w:tcW w:w="1406" w:type="dxa"/>
           </w:tcPr>
           <w:p>
             <w:pPr>
@@ -630,7 +672,7 @@
         </w:tc>
         <w:tc>
           <w:tcPr>
-            <w:tcW w:w="2037" w:type="dxa"/>
+            <w:tcW w:w="1900" w:type="dxa"/>
             <w:vAlign w:val="center"/>
           </w:tcPr>
           <w:p>
@@ -659,7 +701,7 @@
         </w:tc>
         <w:tc>
           <w:tcPr>
-            <w:tcW w:w="2545" w:type="dxa"/>
+            <w:tcW w:w="1782" w:type="dxa"/>
             <w:vAlign w:val="center"/>
           </w:tcPr>
           <w:p>
@@ -720,7 +762,7 @@
         </w:tc>
         <w:tc>
           <w:tcPr>
-            <w:tcW w:w="2804" w:type="dxa"/>
+            <w:tcW w:w="2444" w:type="dxa"/>
           </w:tcPr>
           <w:p>
             <w:pPr>
@@ -745,7 +787,33 @@
         </w:tc>
         <w:tc>
           <w:tcPr>
-            <w:tcW w:w="1506" w:type="dxa"/>
+            <w:tcW w:w="1360" w:type="dxa"/>
+          </w:tcPr>
+          <w:p>
+            <w:pPr>
+              <w:pStyle w:val="NoSpacing"/>
+              <w:jc w:val="center"/>
+              <w:rPr>
+                <w:rFonts w:ascii="Times New Roman" w:hAnsi="Times New Roman" w:cs="Times New Roman"/>
+                <w:sz w:val="24"/>
+                <w:szCs w:val="24"/>
+                <w:lang w:eastAsia="ja-JP"/>
+              </w:rPr>
+            </w:pPr>
+            <w:r>
+              <w:rPr>
+                <w:rFonts w:ascii="Times New Roman" w:hAnsi="Times New Roman" w:cs="Times New Roman"/>
+                <w:sz w:val="24"/>
+                <w:szCs w:val="24"/>
+                <w:lang w:eastAsia="ja-JP"/>
+              </w:rPr>
+              <w:t xml:space="preserve">${siswa_nis}</w:t>
+            </w:r>
+          </w:p>
+        </w:tc>
+        <w:tc>
+          <w:tcPr>
+            <w:tcW w:w="1406" w:type="dxa"/>
           </w:tcPr>
           <w:p>
             <w:pPr>
@@ -771,7 +839,7 @@
         </w:tc>
         <w:tc>
           <w:tcPr>
-            <w:tcW w:w="2037" w:type="dxa"/>
+            <w:tcW w:w="1900" w:type="dxa"/>
           </w:tcPr>
           <w:p>
             <w:pPr>
@@ -797,7 +865,7 @@
         </w:tc>
         <w:tc>
           <w:tcPr>
-            <w:tcW w:w="2545" w:type="dxa"/>
+            <w:tcW w:w="1782" w:type="dxa"/>
           </w:tcPr>
           <w:p>
             <w:pPr>

</xml_diff>